<commit_message>
C: correct baseline comparison and H05 reproduction status
</commit_message>
<xml_diff>
--- a/reports/technical_report_v1_review.docx
+++ b/reports/technical_report_v1_review.docx
@@ -2680,7 +2680,7 @@
           <w:rFonts w:ascii="Times New Roman" w:hAnsi="Times New Roman" w:eastAsia="宋体"/>
           <w:sz w:val="21"/>
         </w:rPr>
-        <w:t>字符 TF-IDF 基线在全体宏 F1 上高于两个 256-token 终点，但低于 512/seed43；其短文本宏 F1 明显低于 512/seed43。主模型 512 相对同 seed 256 的全体宏 F1 提升为：seed42 +0.014202、seed43 +0.053138；临时 S 提升为 seed42 +0.016273、seed43 +0.041295。两项提升均伴随明显的 seed 间波动，不能只报告较优 seed。</w:t>
+        <w:t>字符 TF-IDF 基线在全体宏 F1 上略高于 512/seed43（0.946766 对 0.945575），也高于两个 256-token 终点；但主模型 512/seed43 的短文本宏 F1（0.956943 对 0.918468）和临时 S（0.948986 对 0.938276）更高。主模型 512 相对同 seed 256 的全体宏 F1 提升为：seed42 +0.014202、seed43 +0.053138；临时 S 提升为 seed42 +0.016273、seed43 +0.041295。两项提升均伴随明显的 seed 间波动，不能只报告较优 seed。</w:t>
       </w:r>
     </w:p>
     <w:p>
@@ -4156,22 +4156,22 @@
           <w:rFonts w:ascii="Times New Roman" w:hAnsi="Times New Roman" w:eastAsia="宋体"/>
           <w:sz w:val="21"/>
         </w:rPr>
-        <w:t xml:space="preserve"> 标签是补充分析结论，不等同原核验程序的数值 PASS。当前可以确认的是：</w:t>
+        <w:t xml:space="preserve"> 标签是补充分析结论，不等同原核验程序的数值 PASS。独立接收方已通过 PR #12（commit 36f4fe7）提交六份预测 CSV 及核验证据；主模型方在内存中独立复算，六份文件的 SHA-256、编号/顺序、行数与有限概率均通过，固定 </w:t>
       </w:r>
       <w:r>
         <w:rPr>
-          <w:rFonts w:ascii="Times New Roman" w:hAnsi="Times New Roman" w:eastAsia="宋体"/>
-          <w:b/>
-          <w:sz w:val="21"/>
+          <w:rFonts w:ascii="Consolas" w:hAnsi="Consolas" w:eastAsia="宋体"/>
+          <w:color w:val="7F1D1D"/>
+          <w:sz w:val="20"/>
         </w:rPr>
-        <w:t>0.5 分类决策在 smoke 与 full-dev 上均一致；数值验收差异仍待双方闭环</w:t>
+        <w:t>0.7C+0.3B</w:t>
       </w:r>
       <w:r>
         <w:rPr>
           <w:rFonts w:ascii="Times New Roman" w:hAnsi="Times New Roman" w:eastAsia="宋体"/>
           <w:sz w:val="21"/>
         </w:rPr>
-        <w:t>。CPU 与 CUDA 的浮点差异是可能的解释，但本轮没有取得可独立复核的原始预测分布来证明该原因，因此本文不把原因写成已证实结论，也不把 H05 跨机器数值验收写成已完成。</w:t>
+        <w:t xml:space="preserve"> 公式的最大概率差为 0。smoke_dev 的基线/主模型/融合超限条数为 0/4/0，full-dev 为 0/274/4；两集合所有 0.5 分类决策差异均为 0。原始预测已可独立复核，但原逐点容差仍未通过；CPU 与 CUDA 的浮点差异是可能解释，尚未证实。因此本文只确认“0.5 分类决策一致、原始预测已独立复核”，不把复核完成写成验收标准已满足，也不把 H05 跨机器数值验收写成已完成。</w:t>
       </w:r>
     </w:p>
     <w:p>

</xml_diff>

<commit_message>
C: record CUDA numerical acceptance and confirm V1 candidate
- update report 4.5 to CUDA zero-tolerance results; keep CPU historical 274/4

- remove internal issue/PR/commit locators from the external-facing report

- rebuild DOCX/PDF and extend anonymity check tokens; confirm candidate identity
</commit_message>
<xml_diff>
--- a/reports/technical_report_v1_review.docx
+++ b/reports/technical_report_v1_review.docx
@@ -51,7 +51,7 @@
           <w:color w:val="7F1D1D"/>
           <w:sz w:val="18"/>
         </w:rPr>
-        <w:t>v1-review-20261018</w:t>
+        <w:t>v1-review-20261019</w:t>
       </w:r>
     </w:p>
     <w:p>
@@ -65,7 +65,7 @@
           <w:color w:val="595959"/>
           <w:sz w:val="19"/>
         </w:rPr>
-        <w:t>日期：2026-10-18</w:t>
+        <w:t>日期：2026-10-19</w:t>
       </w:r>
     </w:p>
     <w:p>
@@ -80,6 +80,20 @@
           <w:sz w:val="19"/>
         </w:rPr>
         <w:t>状态：内部开发结果，未冻结；不是官方验证成绩，不用于官方提交</w:t>
+      </w:r>
+    </w:p>
+    <w:p>
+      <w:pPr>
+        <w:spacing w:before="0" w:after="20" w:line="288" w:lineRule="auto"/>
+        <w:jc w:val="center"/>
+      </w:pPr>
+      <w:r>
+        <w:rPr>
+          <w:rFonts w:ascii="Times New Roman" w:hAnsi="Times New Roman" w:eastAsia="宋体"/>
+          <w:color w:val="595959"/>
+          <w:sz w:val="19"/>
+        </w:rPr>
+        <w:t>验收状态：CUDA smoke200/dev15086 数值验收已通过；CPU 历史差异保留；全队冻结待完成</w:t>
       </w:r>
     </w:p>
     <w:p>
@@ -180,7 +194,7 @@
           <w:rFonts w:ascii="Times New Roman" w:hAnsi="Times New Roman" w:eastAsia="宋体"/>
           <w:sz w:val="21"/>
         </w:rPr>
-        <w:t xml:space="preserve"> 融合为 0.968463、0.953381、0.963939，总错误 440 条。上述均为同一 dev 的内部开发结果，阈值为 0.5，短文本按空白计词少于 100 的临时口径；融合权重来自更早的 dev 探索。独立接收方已报告 0.5 分类决策一致，但主模型与融合分量在原逐点容差下分别有 274 条和 4 条超限，数值验收差异仍待双方闭环，因此当前方案尚未冻结。内部 test 与官方验证集均未用于本轮开发、调参或评估。</w:t>
+        <w:t xml:space="preserve"> 融合为 0.968463、0.953381、0.963939，总错误 440 条。上述均为同一 dev 的内部开发结果，阈值为 0.5，短文本按空白计词少于 100 的临时口径；融合权重来自更早的 dev 探索。独立接收方 CUDA 的 smoke200 与 dev15086 原始证据经主模型方独立复算，基线/主模型/融合均按原逐点容差零超限、零 0.5 决策差，固定融合公式最大差为 0；此前 CPU dev 的主模型 274 条、融合 4 条超限保留为历史记录，不表示 CPU 通过。当前方案仍待全队冻结、适用 test 结果归档和最终匿名 PDF。内部 test 与官方验证集均未用于本轮开发、调参或评估。</w:t>
       </w:r>
     </w:p>
     <w:p>
@@ -3560,7 +3574,7 @@
           <w:color w:val="1F3864"/>
           <w:sz w:val="23"/>
         </w:rPr>
-        <w:t>4.5 跨环境加载与独立复现状态</w:t>
+        <w:t>4.5 跨环境加载与数值验收</w:t>
       </w:r>
     </w:p>
     <w:p>
@@ -3646,7 +3660,7 @@
           <w:rFonts w:ascii="Times New Roman" w:hAnsi="Times New Roman" w:eastAsia="宋体"/>
           <w:sz w:val="21"/>
         </w:rPr>
-        <w:t>独立接收方在 CPU 环境按原逐点判据复算的结果如下：</w:t>
+        <w:t>独立接收方在 CUDA 环境提交 smoke200 与 dev15086 的原始预测及核验证据；主模型方仅用标准库对已有 CSV 离线复算，未加载模型或重新推理。结果如下：</w:t>
       </w:r>
     </w:p>
     <w:tbl>
@@ -3658,11 +3672,11 @@
         <w:tblLook w:firstColumn="1" w:firstRow="1" w:lastColumn="0" w:lastRow="0" w:noHBand="0" w:noVBand="1" w:val="04A0"/>
       </w:tblPr>
       <w:tblGrid>
-        <w:gridCol w:w="2608"/>
+        <w:gridCol w:w="1701"/>
         <w:gridCol w:w="1814"/>
+        <w:gridCol w:w="1984"/>
         <w:gridCol w:w="1814"/>
-        <w:gridCol w:w="1701"/>
-        <w:gridCol w:w="1474"/>
+        <w:gridCol w:w="1191"/>
       </w:tblGrid>
       <w:tr>
         <w:trPr>
@@ -3671,7 +3685,7 @@
         </w:trPr>
         <w:tc>
           <w:tcPr>
-            <w:tcW w:type="dxa" w:w="2608"/>
+            <w:tcW w:type="dxa" w:w="1701"/>
             <w:shd w:val="clear" w:color="auto" w:fill="1F3864"/>
           </w:tcPr>
           <w:p>
@@ -3692,7 +3706,7 @@
                 <w:color w:val="FFFFFF"/>
                 <w:sz w:val="17"/>
               </w:rPr>
-              <w:t>检查范围</w:t>
+              <w:t>验收环境 / 范围</w:t>
             </w:r>
           </w:p>
         </w:tc>
@@ -3719,7 +3733,34 @@
                 <w:color w:val="FFFFFF"/>
                 <w:sz w:val="17"/>
               </w:rPr>
-              <w:t>超限条数</w:t>
+              <w:t>基线超限 / 最大绝对差</w:t>
+            </w:r>
+          </w:p>
+        </w:tc>
+        <w:tc>
+          <w:tcPr>
+            <w:tcW w:type="dxa" w:w="1984"/>
+            <w:shd w:val="clear" w:color="auto" w:fill="1F3864"/>
+          </w:tcPr>
+          <w:p>
+            <w:pPr>
+              <w:spacing w:before="0" w:after="0" w:line="252" w:lineRule="auto"/>
+              <w:jc w:val="center"/>
+            </w:pPr>
+            <w:r>
+              <w:rPr>
+                <w:b/>
+                <w:color w:val="FFFFFF"/>
+              </w:rPr>
+            </w:r>
+            <w:r>
+              <w:rPr>
+                <w:rFonts w:ascii="Times New Roman" w:hAnsi="Times New Roman" w:eastAsia="宋体"/>
+                <w:b/>
+                <w:color w:val="FFFFFF"/>
+                <w:sz w:val="17"/>
+              </w:rPr>
+              <w:t>主模型超限 / 最大绝对差</w:t>
             </w:r>
           </w:p>
         </w:tc>
@@ -3746,13 +3787,13 @@
                 <w:color w:val="FFFFFF"/>
                 <w:sz w:val="17"/>
               </w:rPr>
-              <w:t>最大绝对差</w:t>
+              <w:t>融合超限 / 最大绝对差</w:t>
             </w:r>
           </w:p>
         </w:tc>
         <w:tc>
           <w:tcPr>
-            <w:tcW w:type="dxa" w:w="1701"/>
+            <w:tcW w:type="dxa" w:w="1191"/>
             <w:shd w:val="clear" w:color="auto" w:fill="1F3864"/>
           </w:tcPr>
           <w:p>
@@ -3773,34 +3814,7 @@
                 <w:color w:val="FFFFFF"/>
                 <w:sz w:val="17"/>
               </w:rPr>
-              <w:t>0.5 分类决策差异</w:t>
-            </w:r>
-          </w:p>
-        </w:tc>
-        <w:tc>
-          <w:tcPr>
-            <w:tcW w:type="dxa" w:w="1474"/>
-            <w:shd w:val="clear" w:color="auto" w:fill="1F3864"/>
-          </w:tcPr>
-          <w:p>
-            <w:pPr>
-              <w:spacing w:before="0" w:after="0" w:line="252" w:lineRule="auto"/>
-              <w:jc w:val="center"/>
-            </w:pPr>
-            <w:r>
-              <w:rPr>
-                <w:b/>
-                <w:color w:val="FFFFFF"/>
-              </w:rPr>
-            </w:r>
-            <w:r>
-              <w:rPr>
-                <w:rFonts w:ascii="Times New Roman" w:hAnsi="Times New Roman" w:eastAsia="宋体"/>
-                <w:b/>
-                <w:color w:val="FFFFFF"/>
-                <w:sz w:val="17"/>
-              </w:rPr>
-              <w:t>状态</w:t>
+              <w:t>0.5 决策差异</w:t>
             </w:r>
           </w:p>
         </w:tc>
@@ -3811,7 +3825,7 @@
         </w:trPr>
         <w:tc>
           <w:tcPr>
-            <w:tcW w:type="dxa" w:w="2608"/>
+            <w:tcW w:type="dxa" w:w="1701"/>
           </w:tcPr>
           <w:p>
             <w:pPr>
@@ -3824,7 +3838,7 @@
                 <w:rFonts w:ascii="Times New Roman" w:hAnsi="Times New Roman" w:eastAsia="宋体"/>
                 <w:sz w:val="17"/>
               </w:rPr>
-              <w:t>基线 full-dev</w:t>
+              <w:t>CUDA smoke200</w:t>
             </w:r>
           </w:p>
         </w:tc>
@@ -3843,7 +3857,26 @@
                 <w:rFonts w:ascii="Times New Roman" w:hAnsi="Times New Roman" w:eastAsia="宋体"/>
                 <w:sz w:val="17"/>
               </w:rPr>
-              <w:t>0 / 15,086</w:t>
+              <w:t>0 / 4.951e-11</w:t>
+            </w:r>
+          </w:p>
+        </w:tc>
+        <w:tc>
+          <w:tcPr>
+            <w:tcW w:type="dxa" w:w="1984"/>
+          </w:tcPr>
+          <w:p>
+            <w:pPr>
+              <w:spacing w:before="0" w:after="0" w:line="252" w:lineRule="auto"/>
+              <w:jc w:val="center"/>
+            </w:pPr>
+            <w:r/>
+            <w:r>
+              <w:rPr>
+                <w:rFonts w:ascii="Times New Roman" w:hAnsi="Times New Roman" w:eastAsia="宋体"/>
+                <w:sz w:val="17"/>
+              </w:rPr>
+              <w:t>0 / 4.172e-07</w:t>
             </w:r>
           </w:p>
         </w:tc>
@@ -3862,13 +3895,13 @@
                 <w:rFonts w:ascii="Times New Roman" w:hAnsi="Times New Roman" w:eastAsia="宋体"/>
                 <w:sz w:val="17"/>
               </w:rPr>
-              <w:t>5.000e-11</w:t>
+              <w:t>0 / 1.252e-07</w:t>
             </w:r>
           </w:p>
         </w:tc>
         <w:tc>
           <w:tcPr>
-            <w:tcW w:type="dxa" w:w="1701"/>
+            <w:tcW w:type="dxa" w:w="1191"/>
           </w:tcPr>
           <w:p>
             <w:pPr>
@@ -3885,25 +3918,6 @@
             </w:r>
           </w:p>
         </w:tc>
-        <w:tc>
-          <w:tcPr>
-            <w:tcW w:type="dxa" w:w="1474"/>
-          </w:tcPr>
-          <w:p>
-            <w:pPr>
-              <w:spacing w:before="0" w:after="0" w:line="252" w:lineRule="auto"/>
-              <w:jc w:val="center"/>
-            </w:pPr>
-            <w:r/>
-            <w:r>
-              <w:rPr>
-                <w:rFonts w:ascii="Times New Roman" w:hAnsi="Times New Roman" w:eastAsia="宋体"/>
-                <w:sz w:val="17"/>
-              </w:rPr>
-              <w:t>原容差内</w:t>
-            </w:r>
-          </w:p>
-        </w:tc>
       </w:tr>
       <w:tr>
         <w:trPr>
@@ -3911,7 +3925,7 @@
         </w:trPr>
         <w:tc>
           <w:tcPr>
-            <w:tcW w:type="dxa" w:w="2608"/>
+            <w:tcW w:type="dxa" w:w="1701"/>
             <w:shd w:val="clear" w:color="auto" w:fill="F2F5FA"/>
           </w:tcPr>
           <w:p>
@@ -3925,7 +3939,7 @@
                 <w:rFonts w:ascii="Times New Roman" w:hAnsi="Times New Roman" w:eastAsia="宋体"/>
                 <w:sz w:val="17"/>
               </w:rPr>
-              <w:t>主模型 full-dev</w:t>
+              <w:t>CUDA dev15086</w:t>
             </w:r>
           </w:p>
         </w:tc>
@@ -3945,7 +3959,27 @@
                 <w:rFonts w:ascii="Times New Roman" w:hAnsi="Times New Roman" w:eastAsia="宋体"/>
                 <w:sz w:val="17"/>
               </w:rPr>
-              <w:t>274 / 15,086（1.82%）</w:t>
+              <w:t>0 / 5.000e-11</w:t>
+            </w:r>
+          </w:p>
+        </w:tc>
+        <w:tc>
+          <w:tcPr>
+            <w:tcW w:type="dxa" w:w="1984"/>
+            <w:shd w:val="clear" w:color="auto" w:fill="F2F5FA"/>
+          </w:tcPr>
+          <w:p>
+            <w:pPr>
+              <w:spacing w:before="0" w:after="0" w:line="252" w:lineRule="auto"/>
+              <w:jc w:val="center"/>
+            </w:pPr>
+            <w:r/>
+            <w:r>
+              <w:rPr>
+                <w:rFonts w:ascii="Times New Roman" w:hAnsi="Times New Roman" w:eastAsia="宋体"/>
+                <w:sz w:val="17"/>
+              </w:rPr>
+              <w:t>0 / 0</w:t>
             </w:r>
           </w:p>
         </w:tc>
@@ -3965,13 +3999,13 @@
                 <w:rFonts w:ascii="Times New Roman" w:hAnsi="Times New Roman" w:eastAsia="宋体"/>
                 <w:sz w:val="17"/>
               </w:rPr>
-              <w:t>2.557e-05</w:t>
+              <w:t>0 / 3.500e-11</w:t>
             </w:r>
           </w:p>
         </w:tc>
         <w:tc>
           <w:tcPr>
-            <w:tcW w:type="dxa" w:w="1701"/>
+            <w:tcW w:type="dxa" w:w="1191"/>
             <w:shd w:val="clear" w:color="auto" w:fill="F2F5FA"/>
           </w:tcPr>
           <w:p>
@@ -3989,26 +4023,6 @@
             </w:r>
           </w:p>
         </w:tc>
-        <w:tc>
-          <w:tcPr>
-            <w:tcW w:type="dxa" w:w="1474"/>
-            <w:shd w:val="clear" w:color="auto" w:fill="F2F5FA"/>
-          </w:tcPr>
-          <w:p>
-            <w:pPr>
-              <w:spacing w:before="0" w:after="0" w:line="252" w:lineRule="auto"/>
-              <w:jc w:val="center"/>
-            </w:pPr>
-            <w:r/>
-            <w:r>
-              <w:rPr>
-                <w:rFonts w:ascii="Times New Roman" w:hAnsi="Times New Roman" w:eastAsia="宋体"/>
-                <w:sz w:val="17"/>
-              </w:rPr>
-              <w:t>原逐点容差未通过</w:t>
-            </w:r>
-          </w:p>
-        </w:tc>
       </w:tr>
       <w:tr>
         <w:trPr>
@@ -4016,7 +4030,7 @@
         </w:trPr>
         <w:tc>
           <w:tcPr>
-            <w:tcW w:type="dxa" w:w="2608"/>
+            <w:tcW w:type="dxa" w:w="1701"/>
           </w:tcPr>
           <w:p>
             <w:pPr>
@@ -4029,7 +4043,7 @@
                 <w:rFonts w:ascii="Times New Roman" w:hAnsi="Times New Roman" w:eastAsia="宋体"/>
                 <w:sz w:val="17"/>
               </w:rPr>
-              <w:t>融合 full-dev</w:t>
+              <w:t>CPU dev15086（历史）</w:t>
             </w:r>
           </w:p>
         </w:tc>
@@ -4048,7 +4062,26 @@
                 <w:rFonts w:ascii="Times New Roman" w:hAnsi="Times New Roman" w:eastAsia="宋体"/>
                 <w:sz w:val="17"/>
               </w:rPr>
-              <w:t>4 / 15,086（0.027%）</w:t>
+              <w:t>0 / 5.000e-11</w:t>
+            </w:r>
+          </w:p>
+        </w:tc>
+        <w:tc>
+          <w:tcPr>
+            <w:tcW w:type="dxa" w:w="1984"/>
+          </w:tcPr>
+          <w:p>
+            <w:pPr>
+              <w:spacing w:before="0" w:after="0" w:line="252" w:lineRule="auto"/>
+              <w:jc w:val="center"/>
+            </w:pPr>
+            <w:r/>
+            <w:r>
+              <w:rPr>
+                <w:rFonts w:ascii="Times New Roman" w:hAnsi="Times New Roman" w:eastAsia="宋体"/>
+                <w:sz w:val="17"/>
+              </w:rPr>
+              <w:t>274 / 2.557e-05</w:t>
             </w:r>
           </w:p>
         </w:tc>
@@ -4067,13 +4100,13 @@
                 <w:rFonts w:ascii="Times New Roman" w:hAnsi="Times New Roman" w:eastAsia="宋体"/>
                 <w:sz w:val="17"/>
               </w:rPr>
-              <w:t>7.671e-06</w:t>
+              <w:t>4 / 7.671e-06</w:t>
             </w:r>
           </w:p>
         </w:tc>
         <w:tc>
           <w:tcPr>
-            <w:tcW w:type="dxa" w:w="1701"/>
+            <w:tcW w:type="dxa" w:w="1191"/>
           </w:tcPr>
           <w:p>
             <w:pPr>
@@ -4087,25 +4120,6 @@
                 <w:sz w:val="17"/>
               </w:rPr>
               <w:t>0</w:t>
-            </w:r>
-          </w:p>
-        </w:tc>
-        <w:tc>
-          <w:tcPr>
-            <w:tcW w:type="dxa" w:w="1474"/>
-          </w:tcPr>
-          <w:p>
-            <w:pPr>
-              <w:spacing w:before="0" w:after="0" w:line="252" w:lineRule="auto"/>
-              <w:jc w:val="center"/>
-            </w:pPr>
-            <w:r/>
-            <w:r>
-              <w:rPr>
-                <w:rFonts w:ascii="Times New Roman" w:hAnsi="Times New Roman" w:eastAsia="宋体"/>
-                <w:sz w:val="17"/>
-              </w:rPr>
-              <w:t>原逐点容差未通过</w:t>
             </w:r>
           </w:p>
         </w:tc>
@@ -4126,7 +4140,20 @@
           <w:rFonts w:ascii="Times New Roman" w:hAnsi="Times New Roman" w:eastAsia="宋体"/>
           <w:sz w:val="21"/>
         </w:rPr>
-        <w:t xml:space="preserve">原主模型核验脚本在主模型分量上触发 </w:t>
+        <w:t>CUDA 两集合的基线/主模型/融合均按原逐点容差零超限、零 0.5 决策差；固定融合公式两套最大差均为 0，dev 主模型概率与旧参考逐字节一致。第一版 CUDA 数值验收据此关闭；验收范围为 CUDA/FP32/batch8/512，不外推到 CPU 或其他硬件。</w:t>
+      </w:r>
+    </w:p>
+    <w:p>
+      <w:pPr>
+        <w:spacing w:before="0" w:after="80" w:line="324" w:lineRule="auto"/>
+        <w:ind w:firstLine="0"/>
+      </w:pPr>
+      <w:r>
+        <w:rPr>
+          <w:rFonts w:ascii="Times New Roman" w:hAnsi="Times New Roman" w:eastAsia="宋体"/>
+          <w:sz w:val="21"/>
+        </w:rPr>
+        <w:t xml:space="preserve">CPU dev 的主模型 274 条、融合 4 条超限保留为历史记录，仅表示此前原 CPU 条件未通过，不能写成 CPU 已修复或通过。原包核验脚本曾因主模型分量 </w:t>
       </w:r>
       <w:r>
         <w:rPr>
@@ -4141,7 +4168,7 @@
           <w:rFonts w:ascii="Times New Roman" w:hAnsi="Times New Roman" w:eastAsia="宋体"/>
           <w:sz w:val="21"/>
         </w:rPr>
-        <w:t xml:space="preserve">，以非零码退出且未落盘检查 JSON；上述“超限条数”由独立接收方的补充脚本按原容差公式重新统计，其 </w:t>
+        <w:t xml:space="preserve"> 非零退出、</w:t>
       </w:r>
       <w:r>
         <w:rPr>
@@ -4156,22 +4183,7 @@
           <w:rFonts w:ascii="Times New Roman" w:hAnsi="Times New Roman" w:eastAsia="宋体"/>
           <w:sz w:val="21"/>
         </w:rPr>
-        <w:t xml:space="preserve"> 标签是补充分析结论，不等同原核验程序的数值 PASS。独立接收方已通过 PR #12（commit 36f4fe7）提交六份预测 CSV 及核验证据；主模型方在内存中独立复算，六份文件的 SHA-256、编号/顺序、行数与有限概率均通过，固定 </w:t>
-      </w:r>
-      <w:r>
-        <w:rPr>
-          <w:rFonts w:ascii="Consolas" w:hAnsi="Consolas" w:eastAsia="宋体"/>
-          <w:color w:val="7F1D1D"/>
-          <w:sz w:val="20"/>
-        </w:rPr>
-        <w:t>0.7C+0.3B</w:t>
-      </w:r>
-      <w:r>
-        <w:rPr>
-          <w:rFonts w:ascii="Times New Roman" w:hAnsi="Times New Roman" w:eastAsia="宋体"/>
-          <w:sz w:val="21"/>
-        </w:rPr>
-        <w:t xml:space="preserve"> 公式的最大概率差为 0。smoke_dev 的基线/主模型/融合超限条数为 0/4/0，full-dev 为 0/274/4；两集合所有 0.5 分类决策差异均为 0。原始预测已可独立复核，但原逐点容差仍未通过；CPU 与 CUDA 的浮点差异是可能解释，尚未证实。因此本文只确认“0.5 分类决策一致、原始预测已独立复核”，不把复核完成写成验收标准已满足，也不把 H05 跨机器数值验收写成已完成。</w:t>
+        <w:t xml:space="preserve"> 为补充分析标签；该历史记录不影响 CUDA 验收结论，也不等于 CPU 验收通过。全队冻结、适用 test 结果归档和最终匿名 PDF 仍未完成。</w:t>
       </w:r>
     </w:p>
     <w:p>
@@ -4977,6 +4989,49 @@
           </w:p>
         </w:tc>
       </w:tr>
+      <w:tr>
+        <w:trPr>
+          <w:cantSplit w:val="true"/>
+        </w:trPr>
+        <w:tc>
+          <w:tcPr>
+            <w:tcW w:type="dxa" w:w="4706"/>
+          </w:tcPr>
+          <w:p>
+            <w:pPr>
+              <w:spacing w:before="0" w:after="0" w:line="252" w:lineRule="auto"/>
+              <w:jc w:val="left"/>
+            </w:pPr>
+            <w:r/>
+            <w:r>
+              <w:rPr>
+                <w:rFonts w:ascii="Times New Roman" w:hAnsi="Times New Roman" w:eastAsia="宋体"/>
+                <w:sz w:val="17"/>
+              </w:rPr>
+              <w:t>CUDA 数值验收</w:t>
+            </w:r>
+          </w:p>
+        </w:tc>
+        <w:tc>
+          <w:tcPr>
+            <w:tcW w:type="dxa" w:w="4706"/>
+          </w:tcPr>
+          <w:p>
+            <w:pPr>
+              <w:spacing w:before="0" w:after="0" w:line="252" w:lineRule="auto"/>
+              <w:jc w:val="center"/>
+            </w:pPr>
+            <w:r/>
+            <w:r>
+              <w:rPr>
+                <w:rFonts w:ascii="Times New Roman" w:hAnsi="Times New Roman" w:eastAsia="宋体"/>
+                <w:sz w:val="17"/>
+              </w:rPr>
+              <w:t>CUDA；FP32；batch size 8；最大长度 512；原逐点容差与旧参考不变</w:t>
+            </w:r>
+          </w:p>
+        </w:tc>
+      </w:tr>
     </w:tbl>
     <w:p>
       <w:pPr>
@@ -5567,14 +5622,14 @@
           <w:b/>
           <w:sz w:val="21"/>
         </w:rPr>
-        <w:t>独立数值验收未闭环</w:t>
+        <w:t>数值验收范围有限</w:t>
       </w:r>
       <w:r>
         <w:rPr>
           <w:rFonts w:ascii="Times New Roman" w:hAnsi="Times New Roman" w:eastAsia="宋体"/>
           <w:sz w:val="21"/>
         </w:rPr>
-        <w:t>：主模型 274 条、融合 4 条在原逐点容差下超限，虽然 0.5 分类决策全部一致；原因尚未独立证实，不能写成交付验收全部通过。</w:t>
+        <w:t>：CUDA smoke200/dev15086 已按原逐点容差通过，固定融合公式最大差为 0；CPU dev 的主模型 274 条、融合 4 条超限保留为历史记录，不表示 CPU 通过。CPU/CUDA 差异原因未在本报告中重新证明，结论不外推到其他硬件。</w:t>
       </w:r>
     </w:p>
     <w:p>
@@ -5664,7 +5719,7 @@
           <w:rFonts w:ascii="Times New Roman" w:hAnsi="Times New Roman" w:eastAsia="宋体"/>
           <w:sz w:val="21"/>
         </w:rPr>
-        <w:t>：内部 test 仍封存，官方验证集未访问；最终一次 test 验收和官方推理须在冻结后按团队流程执行。早期预处理脚本曾在控制台打印各集合示例（含 test）；当前版本已将示例输出限制为 train/dev，本轮未读取或使用 test 正文。</w:t>
+        <w:t>：内部 test 仍封存，官方验证集未访问；既有 test 结果是否适用于本候选由数据与评测流程核对，适用则归档，缺失时只列待办，不重复运行；官方推理须在冻结后按团队流程执行。早期预处理脚本曾在控制台打印各集合示例（含 test）；当前版本已将示例输出限制为 train/dev，本轮未读取或使用 test 正文。</w:t>
       </w:r>
     </w:p>
     <w:p>
@@ -5735,7 +5790,7 @@
           <w:rFonts w:ascii="Times New Roman" w:hAnsi="Times New Roman" w:eastAsia="宋体"/>
           <w:sz w:val="21"/>
         </w:rPr>
-        <w:t>当前第一版候选为：</w:t>
+        <w:t>当前第一版候选确认为：</w:t>
       </w:r>
       <w:r>
         <w:rPr>
@@ -5758,14 +5813,14 @@
           <w:color w:val="7F1D1D"/>
           <w:sz w:val="20"/>
         </w:rPr>
-        <w:t>0.7/0.3</w:t>
+        <w:t>0.7×基线 + 0.3×主模型</w:t>
       </w:r>
       <w:r>
         <w:rPr>
           <w:rFonts w:ascii="Times New Roman" w:hAnsi="Times New Roman" w:eastAsia="宋体"/>
           <w:sz w:val="21"/>
         </w:rPr>
-        <w:t xml:space="preserve"> 概率融合；阈值 0.5，输出保留 </w:t>
+        <w:t xml:space="preserve"> 概率融合；阈值 0.5，human=0、machine=1，输出保留 </w:t>
       </w:r>
       <w:r>
         <w:rPr>
@@ -5780,7 +5835,7 @@
           <w:rFonts w:ascii="Times New Roman" w:hAnsi="Times New Roman" w:eastAsia="宋体"/>
           <w:sz w:val="21"/>
         </w:rPr>
-        <w:t>。该候选已经完成本机保存重载、统一入口和跨环境加载复核，但</w:t>
+        <w:t>。该候选已经完成本机保存重载、统一入口、跨环境加载和 CUDA 数值验收；CPU 历史差异保留为历史记录，不写成 CPU 通过。</w:t>
       </w:r>
       <w:r>
         <w:rPr>
@@ -5788,7 +5843,7 @@
           <w:b/>
           <w:sz w:val="21"/>
         </w:rPr>
-        <w:t>尚未完成独立数值验收闭环与全队冻结</w:t>
+        <w:t>全队冻结、适用 test 结果归档和最终匿名 PDF 尚未完成</w:t>
       </w:r>
       <w:r>
         <w:rPr>
@@ -5830,7 +5885,7 @@
           <w:rFonts w:ascii="Times New Roman" w:hAnsi="Times New Roman" w:eastAsia="宋体"/>
           <w:sz w:val="21"/>
         </w:rPr>
-        <w:t>独立接收方与主模型方按原容差公式完成数值差异闭环，确认是否需要修复或单独审议跨环境验收标准；</w:t>
+        <w:t>全队确认数据、模型、融合和内部评测口径，记录第一版冻结版本与日期；数据与评测流程核对既有 test 证据是否适用于本候选，适用则归档，缺失时只列待办，不重复运行。</w:t>
       </w:r>
     </w:p>
     <w:p>
@@ -5852,7 +5907,7 @@
           <w:rFonts w:ascii="Times New Roman" w:hAnsi="Times New Roman" w:eastAsia="宋体"/>
           <w:sz w:val="21"/>
         </w:rPr>
-        <w:t>全队确认数据、模型、融合和内部评测口径，记录第一版冻结版本与日期；</w:t>
+        <w:t>报告维护方将适用的 test 结果纳入同一报告，完成最终匿名 PDF、来源/许可证声明和提交材料核对。</w:t>
       </w:r>
     </w:p>
     <w:p>
@@ -5874,44 +5929,7 @@
           <w:rFonts w:ascii="Times New Roman" w:hAnsi="Times New Roman" w:eastAsia="宋体"/>
           <w:sz w:val="21"/>
         </w:rPr>
-        <w:t>冻结后由数据与评测流程执行</w:t>
-      </w:r>
-      <w:r>
-        <w:rPr>
-          <w:rFonts w:ascii="Times New Roman" w:hAnsi="Times New Roman" w:eastAsia="宋体"/>
-          <w:b/>
-          <w:sz w:val="21"/>
-        </w:rPr>
-        <w:t>一次</w:t>
-      </w:r>
-      <w:r>
-        <w:rPr>
-          <w:rFonts w:ascii="Times New Roman" w:hAnsi="Times New Roman" w:eastAsia="宋体"/>
-          <w:sz w:val="21"/>
-        </w:rPr>
-        <w:t>内部 test 正式验收，结果用于验收与报告，不回流反复选参；</w:t>
-      </w:r>
-    </w:p>
-    <w:p>
-      <w:pPr>
-        <w:spacing w:before="0" w:after="40" w:line="312" w:lineRule="auto"/>
-        <w:ind w:hanging="255" w:left="425"/>
-      </w:pPr>
-      <w:r>
-        <w:rPr>
-          <w:rFonts w:ascii="Times New Roman" w:hAnsi="Times New Roman" w:eastAsia="宋体"/>
-          <w:b/>
-          <w:color w:val="1F3864"/>
-          <w:sz w:val="21"/>
-        </w:rPr>
-        <w:t xml:space="preserve">4. </w:t>
-      </w:r>
-      <w:r>
-        <w:rPr>
-          <w:rFonts w:ascii="Times New Roman" w:hAnsi="Times New Roman" w:eastAsia="宋体"/>
-          <w:sz w:val="21"/>
-        </w:rPr>
-        <w:t>轻量基线与报告维护方把 test 结果纳入同一报告，完成最终匿名 PDF、来源/许可证声明和提交材料核对。</w:t>
+        <w:t>数据使用/再分发条款按数据与评测流程提供的依据更新同一清单。</w:t>
       </w:r>
     </w:p>
     <w:p>
@@ -5924,7 +5942,7 @@
           <w:rFonts w:ascii="Times New Roman" w:hAnsi="Times New Roman" w:eastAsia="宋体"/>
           <w:sz w:val="21"/>
         </w:rPr>
-        <w:t>在上述步骤完成前，不追加融合权重、阈值或校准搜索，不把 dev 分数写成官方成绩，不运行内部 test 或官方验证集。</w:t>
+        <w:t>在上述步骤完成前，不追加融合权重、阈值或校准搜索，不把 dev 分数写成官方成绩，不训练、推理或读取官方验证集。</w:t>
       </w:r>
     </w:p>
     <w:p>
@@ -7354,7 +7372,7 @@
           <w:rFonts w:ascii="Times New Roman" w:hAnsi="Times New Roman" w:eastAsia="宋体"/>
           <w:sz w:val="21"/>
         </w:rPr>
-        <w:t>最终匿名 PDF 在冻结与一次 test 验收后生成；当前 PDF 为内部审阅稿。</w:t>
+        <w:t>最终匿名 PDF 在冻结并确认适用 test 结果后生成；当前 PDF 为内部审阅稿。</w:t>
       </w:r>
     </w:p>
     <w:sectPr>

</xml_diff>

<commit_message>
C: finalize V1-20261019 frozen candidate report
- record freeze ID/date and existing V1 test-evidence archive status

- remove stale test-sealed claims; keep CPU historical and data-term gap explicit

- parse PDF XMP metadata; rebuild DOCX/PDF and update anonymity check
</commit_message>
<xml_diff>
--- a/reports/technical_report_v1_review.docx
+++ b/reports/technical_report_v1_review.docx
@@ -29,7 +29,7 @@
           <w:color w:val="1F3864"/>
           <w:sz w:val="24"/>
         </w:rPr>
-        <w:t>初赛第一版候选 · 内部审阅稿</w:t>
+        <w:t>初赛第一版候选 · 最终报告稿</w:t>
       </w:r>
     </w:p>
     <w:p>
@@ -51,7 +51,7 @@
           <w:color w:val="7F1D1D"/>
           <w:sz w:val="18"/>
         </w:rPr>
-        <w:t>v1-review-20261019</w:t>
+        <w:t>V1-20261019</w:t>
       </w:r>
     </w:p>
     <w:p>
@@ -79,7 +79,7 @@
           <w:color w:val="595959"/>
           <w:sz w:val="19"/>
         </w:rPr>
-        <w:t>状态：内部开发结果，未冻结；不是官方验证成绩，不用于官方提交</w:t>
+        <w:t>状态：第一版候选方案已冻结（V1-20261019，2026-10-19）；最终发行与比赛提交尚未完成</w:t>
       </w:r>
     </w:p>
     <w:p>
@@ -93,7 +93,7 @@
           <w:color w:val="595959"/>
           <w:sz w:val="19"/>
         </w:rPr>
-        <w:t>验收状态：CUDA smoke200/dev15086 数值验收已通过；CPU 历史差异保留；全队冻结待完成</w:t>
+        <w:t>验收状态：CUDA smoke200/dev15086 数值验收已通过；CPU 历史差异保留；既有 test 结果待归档核对</w:t>
       </w:r>
     </w:p>
     <w:p>
@@ -194,7 +194,7 @@
           <w:rFonts w:ascii="Times New Roman" w:hAnsi="Times New Roman" w:eastAsia="宋体"/>
           <w:sz w:val="21"/>
         </w:rPr>
-        <w:t xml:space="preserve"> 融合为 0.968463、0.953381、0.963939，总错误 440 条。上述均为同一 dev 的内部开发结果，阈值为 0.5，短文本按空白计词少于 100 的临时口径；融合权重来自更早的 dev 探索。独立接收方 CUDA 的 smoke200 与 dev15086 原始证据经主模型方独立复算，基线/主模型/融合均按原逐点容差零超限、零 0.5 决策差，固定融合公式最大差为 0；此前 CPU dev 的主模型 274 条、融合 4 条超限保留为历史记录，不表示 CPU 通过。当前方案仍待全队冻结、适用 test 结果归档和最终匿名 PDF。内部 test 与官方验证集均未用于本轮开发、调参或评估。</w:t>
+        <w:t xml:space="preserve"> 融合为 0.968463、0.953381、0.963939，总错误 440 条。上述均为同一 dev 的内部开发结果，阈值为 0.5，短文本按空白计词少于 100 的临时口径；融合权重来自更早的 dev 探索。独立接收方 CUDA 的 smoke200 与 dev15086 原始证据经主模型方独立复算，基线/主模型/融合均按原逐点容差零超限、零 0.5 决策差，固定融合公式最大差为 0；此前 CPU dev 的主模型 274 条、融合 4 条超限保留为历史记录，不表示 CPU 通过。第一版候选方案已于 2026-10-19 冻结为 V1-20261019；最终发行、既有 test 结果的归档核对和最终匿名 PDF 尚未完成。本文 dev 开发未使用 test 选参；已有同一冻结参数的 test 结果待归档核对，官方验证集未用于本轮开发、调参或评估。</w:t>
       </w:r>
     </w:p>
     <w:p>
@@ -368,7 +368,7 @@
           <w:rFonts w:ascii="Times New Roman" w:hAnsi="Times New Roman" w:eastAsia="宋体"/>
           <w:sz w:val="21"/>
         </w:rPr>
-        <w:t>全流程使用同一固定数据划分，不自行重新切分。所有比较只在 train/dev 上进行；内部 test 在方案冻结前保持封存，官方验证集只允许在冻结后做最终推理。</w:t>
+        <w:t>全流程使用同一固定数据划分，不自行重新切分。所有比较只在 train/dev 上进行；内部 test 不参与开发选择，同一冻结参数的既有 test 结果待归档核对，不回流选参；官方验证集只允许在冻结后做最终推理。</w:t>
       </w:r>
     </w:p>
     <w:p>
@@ -860,7 +860,7 @@
                 <w:rFonts w:ascii="Times New Roman" w:hAnsi="Times New Roman" w:eastAsia="宋体"/>
                 <w:sz w:val="17"/>
               </w:rPr>
-              <w:t>Test（未使用）</w:t>
+              <w:t>Test（未参与本文开发）</w:t>
             </w:r>
           </w:p>
         </w:tc>
@@ -1024,7 +1024,7 @@
           <w:rFonts w:ascii="Times New Roman" w:hAnsi="Times New Roman" w:eastAsia="宋体"/>
           <w:sz w:val="21"/>
         </w:rPr>
-        <w:t>数据来源与许可：原始数据由赛题方提供，本文不声称拥有或重新许可该数据；数据使用、再分发和提交范围受赛题规则约束。具体条款仍由数据负责人对照赛题规则确认并在最终提交前记录。</w:t>
+        <w:t>数据来源与许可：原始数据由赛题方提供，本文不声称拥有或重新许可该数据；数据使用、再分发和提交范围受赛题规则约束。当前仍缺明确的数据使用/再分发条款依据，数据与评测流程已在原 issue 请求补充；最终提交前需按赛题规则补齐并记录。</w:t>
       </w:r>
     </w:p>
     <w:p>
@@ -1138,7 +1138,7 @@
           <w:rFonts w:ascii="Times New Roman" w:hAnsi="Times New Roman" w:eastAsia="宋体"/>
           <w:sz w:val="21"/>
         </w:rPr>
-        <w:t xml:space="preserve"> dev 上的开发结果，不是官方验证集、隐藏测试集或内部 test 成绩。内部 test 未参与模型训练、调参、评估或融合选择；官方验证集未用于文本探查、统计或调参。</w:t>
+        <w:t xml:space="preserve"> dev 上的开发结果，不是官方验证集、隐藏测试集或内部 test 成绩。内部 test 未用于模型训练、调参或融合选择；同一冻结参数的既有 test 推理结果待归档核对，未回流选参；官方验证集未用于文本探查、统计或调参。</w:t>
       </w:r>
     </w:p>
     <w:p>
@@ -4183,7 +4183,7 @@
           <w:rFonts w:ascii="Times New Roman" w:hAnsi="Times New Roman" w:eastAsia="宋体"/>
           <w:sz w:val="21"/>
         </w:rPr>
-        <w:t xml:space="preserve"> 为补充分析标签；该历史记录不影响 CUDA 验收结论，也不等于 CPU 验收通过。全队冻结、适用 test 结果归档和最终匿名 PDF 仍未完成。</w:t>
+        <w:t xml:space="preserve"> 为补充分析标签；该历史记录不影响 CUDA 验收结论，也不等于 CPU 验收通过。候选方案已冻结为 V1-20261019；既有 test 结果归档核对与最终匿名 PDF 仍未完成。</w:t>
       </w:r>
     </w:p>
     <w:p>
@@ -5712,14 +5712,14 @@
           <w:b/>
           <w:sz w:val="21"/>
         </w:rPr>
-        <w:t>test/官方验证集未使用</w:t>
+        <w:t>test 结果待归档核对</w:t>
       </w:r>
       <w:r>
         <w:rPr>
           <w:rFonts w:ascii="Times New Roman" w:hAnsi="Times New Roman" w:eastAsia="宋体"/>
           <w:sz w:val="21"/>
         </w:rPr>
-        <w:t>：内部 test 仍封存，官方验证集未访问；既有 test 结果是否适用于本候选由数据与评测流程核对，适用则归档，缺失时只列待办，不重复运行；官方推理须在冻结后按团队流程执行。早期预处理脚本曾在控制台打印各集合示例（含 test）；当前版本已将示例输出限制为 train/dev，本轮未读取或使用 test 正文。</w:t>
+        <w:t>：本文 dev 开发未使用 test 选参；同一冻结参数的既有内部 test 结果待数据与评测流程归档核对，该运行早于本次全队确认，不能写成冻结后首次执行；本文未用 test 标签重算指标，不重复运行，不混入其他方案结果。官方验证集未访问；官方推理须在冻结后按团队流程执行。早期预处理脚本曾在控制台打印各集合示例（含 test）；当前版本已将示例输出限制为 train/dev，本文未读取或使用 test 正文。</w:t>
       </w:r>
     </w:p>
     <w:p>
@@ -5790,7 +5790,22 @@
           <w:rFonts w:ascii="Times New Roman" w:hAnsi="Times New Roman" w:eastAsia="宋体"/>
           <w:sz w:val="21"/>
         </w:rPr>
-        <w:t>当前第一版候选确认为：</w:t>
+        <w:t xml:space="preserve">第一版候选方案已于 2026-10-19 由三方冻结为 </w:t>
+      </w:r>
+      <w:r>
+        <w:rPr>
+          <w:rFonts w:ascii="Consolas" w:hAnsi="Consolas" w:eastAsia="宋体"/>
+          <w:color w:val="7F1D1D"/>
+          <w:sz w:val="20"/>
+        </w:rPr>
+        <w:t>V1-20261019</w:t>
+      </w:r>
+      <w:r>
+        <w:rPr>
+          <w:rFonts w:ascii="Times New Roman" w:hAnsi="Times New Roman" w:eastAsia="宋体"/>
+          <w:sz w:val="21"/>
+        </w:rPr>
+        <w:t>，候选为：</w:t>
       </w:r>
       <w:r>
         <w:rPr>
@@ -5835,7 +5850,7 @@
           <w:rFonts w:ascii="Times New Roman" w:hAnsi="Times New Roman" w:eastAsia="宋体"/>
           <w:sz w:val="21"/>
         </w:rPr>
-        <w:t>。该候选已经完成本机保存重载、统一入口、跨环境加载和 CUDA 数值验收；CPU 历史差异保留为历史记录，不写成 CPU 通过。</w:t>
+        <w:t>。该候选已经完成本机保存重载、统一入口、跨环境加载和 CUDA 数值验收；CPU 历史差异保留为历史记录，不写成 CPU 通过。冻结的是候选方案、数据、融合和内部评测口径，不是最终发行或比赛提交。</w:t>
       </w:r>
       <w:r>
         <w:rPr>
@@ -5843,14 +5858,14 @@
           <w:b/>
           <w:sz w:val="21"/>
         </w:rPr>
-        <w:t>全队冻结、适用 test 结果归档和最终匿名 PDF 尚未完成</w:t>
+        <w:t>既有 test 结果归档核对、数据条款和最终匿名 PDF 尚未完成</w:t>
       </w:r>
       <w:r>
         <w:rPr>
           <w:rFonts w:ascii="Times New Roman" w:hAnsi="Times New Roman" w:eastAsia="宋体"/>
           <w:sz w:val="21"/>
         </w:rPr>
-        <w:t>，因此本文仍是内部审阅稿，不是最终冻结版本。</w:t>
+        <w:t>，因此本稿是冻结候选的最终报告稿，不是比赛提交版。</w:t>
       </w:r>
     </w:p>
     <w:p>
@@ -5885,7 +5900,22 @@
           <w:rFonts w:ascii="Times New Roman" w:hAnsi="Times New Roman" w:eastAsia="宋体"/>
           <w:sz w:val="21"/>
         </w:rPr>
-        <w:t>全队确认数据、模型、融合和内部评测口径，记录第一版冻结版本与日期；数据与评测流程核对既有 test 证据是否适用于本候选，适用则归档，缺失时只列待办，不重复运行。</w:t>
+        <w:t xml:space="preserve">冻结已记录为 </w:t>
+      </w:r>
+      <w:r>
+        <w:rPr>
+          <w:rFonts w:ascii="Consolas" w:hAnsi="Consolas" w:eastAsia="宋体"/>
+          <w:color w:val="7F1D1D"/>
+          <w:sz w:val="20"/>
+        </w:rPr>
+        <w:t>V1-20261019</w:t>
+      </w:r>
+      <w:r>
+        <w:rPr>
+          <w:rFonts w:ascii="Times New Roman" w:hAnsi="Times New Roman" w:eastAsia="宋体"/>
+          <w:sz w:val="21"/>
+        </w:rPr>
+        <w:t>（2026-10-19）；数据与评测流程核对既有 test 结果的归档与提交口径，缺失时只列待办，不重复运行。</w:t>
       </w:r>
     </w:p>
     <w:p>
@@ -5907,7 +5937,7 @@
           <w:rFonts w:ascii="Times New Roman" w:hAnsi="Times New Roman" w:eastAsia="宋体"/>
           <w:sz w:val="21"/>
         </w:rPr>
-        <w:t>报告维护方将适用的 test 结果纳入同一报告，完成最终匿名 PDF、来源/许可证声明和提交材料核对。</w:t>
+        <w:t>报告维护方将经核对的既有 test 结果纳入同一报告，完成最终匿名 PDF、来源/许可证声明和提交材料核对。</w:t>
       </w:r>
     </w:p>
     <w:p>
@@ -6368,7 +6398,7 @@
                 <w:rFonts w:ascii="Times New Roman" w:hAnsi="Times New Roman" w:eastAsia="宋体"/>
                 <w:sz w:val="17"/>
               </w:rPr>
-              <w:t>来源与哈希已核对；具体条款待数据负责人确认</w:t>
+              <w:t>来源与哈希已核对；使用/再分发条款仍缺明确依据，已在原 issue 请求，最终提交前补齐</w:t>
             </w:r>
           </w:p>
         </w:tc>
@@ -7372,7 +7402,22 @@
           <w:rFonts w:ascii="Times New Roman" w:hAnsi="Times New Roman" w:eastAsia="宋体"/>
           <w:sz w:val="21"/>
         </w:rPr>
-        <w:t>最终匿名 PDF 在冻结并确认适用 test 结果后生成；当前 PDF 为内部审阅稿。</w:t>
+        <w:t xml:space="preserve">冻结已记录为 </w:t>
+      </w:r>
+      <w:r>
+        <w:rPr>
+          <w:rFonts w:ascii="Consolas" w:hAnsi="Consolas" w:eastAsia="宋体"/>
+          <w:color w:val="7F1D1D"/>
+          <w:sz w:val="20"/>
+        </w:rPr>
+        <w:t>V1-20261019</w:t>
+      </w:r>
+      <w:r>
+        <w:rPr>
+          <w:rFonts w:ascii="Times New Roman" w:hAnsi="Times New Roman" w:eastAsia="宋体"/>
+          <w:sz w:val="21"/>
+        </w:rPr>
+        <w:t>（2026-10-19）；最终匿名 PDF 在既有 test 口径归档核对和数据条款落实后生成；当前 PDF 为冻结候选报告稿。</w:t>
       </w:r>
     </w:p>
     <w:sectPr>

</xml_diff>

<commit_message>
C: remove remaining internal issue reference from final report
- replace issue wording with neutral archive request

- rebuild DOCX/PDF and update anonymity check JSON
</commit_message>
<xml_diff>
--- a/reports/technical_report_v1_review.docx
+++ b/reports/technical_report_v1_review.docx
@@ -1024,7 +1024,7 @@
           <w:rFonts w:ascii="Times New Roman" w:hAnsi="Times New Roman" w:eastAsia="宋体"/>
           <w:sz w:val="21"/>
         </w:rPr>
-        <w:t>数据来源与许可：原始数据由赛题方提供，本文不声称拥有或重新许可该数据；数据使用、再分发和提交范围受赛题规则约束。当前仍缺明确的数据使用/再分发条款依据，数据与评测流程已在原 issue 请求补充；最终提交前需按赛题规则补齐并记录。</w:t>
+        <w:t>数据来源与许可：原始数据由赛题方提供，本文不声称拥有或重新许可该数据；数据使用、再分发和提交范围受赛题规则约束。当前仍缺明确的数据使用/再分发条款依据，数据与评测流程已请求补充；最终提交前需按赛题规则补齐并记录。</w:t>
       </w:r>
     </w:p>
     <w:p>
@@ -6398,7 +6398,7 @@
                 <w:rFonts w:ascii="Times New Roman" w:hAnsi="Times New Roman" w:eastAsia="宋体"/>
                 <w:sz w:val="17"/>
               </w:rPr>
-              <w:t>来源与哈希已核对；使用/再分发条款仍缺明确依据，已在原 issue 请求，最终提交前补齐</w:t>
+              <w:t>来源与哈希已核对；使用/再分发条款仍缺明确依据，已请求补充，最终提交前补齐</w:t>
             </w:r>
           </w:p>
         </w:tc>

</xml_diff>